<commit_message>
modif analyse cahier des charges
</commit_message>
<xml_diff>
--- a/ressources/Analyse Cahier des Charges BookHub.docx
+++ b/ressources/Analyse Cahier des Charges BookHub.docx
@@ -1765,7 +1765,6 @@
     </w:p>
     <w:p>
       <w:pPr>
-        <w:spacing w:after="0"/>
         <w:rPr>
           <w:b/>
           <w:bCs/>
@@ -1776,6 +1775,23 @@
           <w:b/>
           <w:bCs/>
         </w:rPr>
+        <w:br w:type="page"/>
+      </w:r>
+    </w:p>
+    <w:p>
+      <w:pPr>
+        <w:spacing w:after="0"/>
+        <w:rPr>
+          <w:b/>
+          <w:bCs/>
+        </w:rPr>
+      </w:pPr>
+      <w:r>
+        <w:rPr>
+          <w:b/>
+          <w:bCs/>
+        </w:rPr>
+        <w:lastRenderedPageBreak/>
         <w:t>Contraintes non fonctionnelles</w:t>
       </w:r>
     </w:p>
@@ -1809,9 +1825,9 @@
         <w:tblLook w:val="04A0" w:firstRow="1" w:lastRow="0" w:firstColumn="1" w:lastColumn="0" w:noHBand="0" w:noVBand="1"/>
       </w:tblPr>
       <w:tblGrid>
-        <w:gridCol w:w="1390"/>
-        <w:gridCol w:w="2593"/>
-        <w:gridCol w:w="4499"/>
+        <w:gridCol w:w="1894"/>
+        <w:gridCol w:w="2654"/>
+        <w:gridCol w:w="3934"/>
       </w:tblGrid>
       <w:tr>
         <w:trPr>
@@ -2272,7 +2288,7 @@
               <w:cnfStyle w:val="000000100000" w:firstRow="0" w:lastRow="0" w:firstColumn="0" w:lastColumn="0" w:oddVBand="0" w:evenVBand="0" w:oddHBand="1" w:evenHBand="0" w:firstRowFirstColumn="0" w:firstRowLastColumn="0" w:lastRowFirstColumn="0" w:lastRowLastColumn="0"/>
             </w:pPr>
             <w:r>
-              <w:t>Mise à jour en temps réel</w:t>
+              <w:t>Optimisation des temps de chargement</w:t>
             </w:r>
           </w:p>
         </w:tc>
@@ -2287,7 +2303,194 @@
               <w:cnfStyle w:val="000000100000" w:firstRow="0" w:lastRow="0" w:firstColumn="0" w:lastColumn="0" w:oddVBand="0" w:evenVBand="0" w:oddHBand="1" w:evenHBand="0" w:firstRowFirstColumn="0" w:firstRowLastColumn="0" w:lastRowFirstColumn="0" w:lastRowLastColumn="0"/>
             </w:pPr>
             <w:r>
-              <w:t>Cohérence immédiate des informations</w:t>
+              <w:t>Optimisations techniques pour permettre un délai de chargement satisfaisant</w:t>
+            </w:r>
+          </w:p>
+        </w:tc>
+      </w:tr>
+      <w:tr>
+        <w:trPr>
+          <w:trHeight w:val="282"/>
+        </w:trPr>
+        <w:tc>
+          <w:tcPr>
+            <w:cnfStyle w:val="001000000000" w:firstRow="0" w:lastRow="0" w:firstColumn="1" w:lastColumn="0" w:oddVBand="0" w:evenVBand="0" w:oddHBand="0" w:evenHBand="0" w:firstRowFirstColumn="0" w:firstRowLastColumn="0" w:lastRowFirstColumn="0" w:lastRowLastColumn="0"/>
+            <w:tcW w:w="0" w:type="auto"/>
+          </w:tcPr>
+          <w:p/>
+        </w:tc>
+        <w:tc>
+          <w:tcPr>
+            <w:tcW w:w="0" w:type="auto"/>
+          </w:tcPr>
+          <w:p>
+            <w:pPr>
+              <w:cnfStyle w:val="000000000000" w:firstRow="0" w:lastRow="0" w:firstColumn="0" w:lastColumn="0" w:oddVBand="0" w:evenVBand="0" w:oddHBand="0" w:evenHBand="0" w:firstRowFirstColumn="0" w:firstRowLastColumn="0" w:lastRowFirstColumn="0" w:lastRowLastColumn="0"/>
+            </w:pPr>
+            <w:r>
+              <w:t>Compatibilité opérationnelle</w:t>
+            </w:r>
+          </w:p>
+        </w:tc>
+        <w:tc>
+          <w:tcPr>
+            <w:tcW w:w="0" w:type="auto"/>
+          </w:tcPr>
+          <w:p>
+            <w:pPr>
+              <w:cnfStyle w:val="000000000000" w:firstRow="0" w:lastRow="0" w:firstColumn="0" w:lastColumn="0" w:oddVBand="0" w:evenVBand="0" w:oddHBand="0" w:evenHBand="0" w:firstRowFirstColumn="0" w:firstRowLastColumn="0" w:lastRowFirstColumn="0" w:lastRowLastColumn="0"/>
+            </w:pPr>
+            <w:r>
+              <w:t>Compatibilité avec les versions le plus récentes de divers navigateurs et appareils</w:t>
+            </w:r>
+          </w:p>
+        </w:tc>
+      </w:tr>
+      <w:tr>
+        <w:trPr>
+          <w:cnfStyle w:val="000000100000" w:firstRow="0" w:lastRow="0" w:firstColumn="0" w:lastColumn="0" w:oddVBand="0" w:evenVBand="0" w:oddHBand="1" w:evenHBand="0" w:firstRowFirstColumn="0" w:firstRowLastColumn="0" w:lastRowFirstColumn="0" w:lastRowLastColumn="0"/>
+          <w:trHeight w:val="290"/>
+        </w:trPr>
+        <w:tc>
+          <w:tcPr>
+            <w:cnfStyle w:val="001000000000" w:firstRow="0" w:lastRow="0" w:firstColumn="1" w:lastColumn="0" w:oddVBand="0" w:evenVBand="0" w:oddHBand="0" w:evenHBand="0" w:firstRowFirstColumn="0" w:firstRowLastColumn="0" w:lastRowFirstColumn="0" w:lastRowLastColumn="0"/>
+            <w:tcW w:w="0" w:type="auto"/>
+            <w:hideMark/>
+          </w:tcPr>
+          <w:p>
+            <w:pPr>
+              <w:spacing w:line="276" w:lineRule="auto"/>
+            </w:pPr>
+            <w:r>
+              <w:t>Ergonomie</w:t>
+            </w:r>
+          </w:p>
+        </w:tc>
+        <w:tc>
+          <w:tcPr>
+            <w:tcW w:w="0" w:type="auto"/>
+            <w:hideMark/>
+          </w:tcPr>
+          <w:p>
+            <w:pPr>
+              <w:spacing w:line="276" w:lineRule="auto"/>
+              <w:cnfStyle w:val="000000100000" w:firstRow="0" w:lastRow="0" w:firstColumn="0" w:lastColumn="0" w:oddVBand="0" w:evenVBand="0" w:oddHBand="1" w:evenHBand="0" w:firstRowFirstColumn="0" w:firstRowLastColumn="0" w:lastRowFirstColumn="0" w:lastRowLastColumn="0"/>
+            </w:pPr>
+            <w:r>
+              <w:t>Interface simple et accessible</w:t>
+            </w:r>
+          </w:p>
+        </w:tc>
+        <w:tc>
+          <w:tcPr>
+            <w:tcW w:w="0" w:type="auto"/>
+            <w:hideMark/>
+          </w:tcPr>
+          <w:p>
+            <w:pPr>
+              <w:spacing w:line="276" w:lineRule="auto"/>
+              <w:cnfStyle w:val="000000100000" w:firstRow="0" w:lastRow="0" w:firstColumn="0" w:lastColumn="0" w:oddVBand="0" w:evenVBand="0" w:oddHBand="1" w:evenHBand="0" w:firstRowFirstColumn="0" w:firstRowLastColumn="0" w:lastRowFirstColumn="0" w:lastRowLastColumn="0"/>
+            </w:pPr>
+            <w:r>
+              <w:t>Facilité d'utilisation pour tous</w:t>
+            </w:r>
+          </w:p>
+        </w:tc>
+      </w:tr>
+      <w:tr>
+        <w:trPr>
+          <w:trHeight w:val="282"/>
+        </w:trPr>
+        <w:tc>
+          <w:tcPr>
+            <w:cnfStyle w:val="001000000000" w:firstRow="0" w:lastRow="0" w:firstColumn="1" w:lastColumn="0" w:oddVBand="0" w:evenVBand="0" w:oddHBand="0" w:evenHBand="0" w:firstRowFirstColumn="0" w:firstRowLastColumn="0" w:lastRowFirstColumn="0" w:lastRowLastColumn="0"/>
+            <w:tcW w:w="0" w:type="auto"/>
+            <w:hideMark/>
+          </w:tcPr>
+          <w:p>
+            <w:pPr>
+              <w:spacing w:line="276" w:lineRule="auto"/>
+            </w:pPr>
+            <w:r>
+              <w:t>Fiabilité</w:t>
+            </w:r>
+          </w:p>
+        </w:tc>
+        <w:tc>
+          <w:tcPr>
+            <w:tcW w:w="0" w:type="auto"/>
+            <w:hideMark/>
+          </w:tcPr>
+          <w:p>
+            <w:pPr>
+              <w:spacing w:line="276" w:lineRule="auto"/>
+              <w:cnfStyle w:val="000000000000" w:firstRow="0" w:lastRow="0" w:firstColumn="0" w:lastColumn="0" w:oddVBand="0" w:evenVBand="0" w:oddHBand="0" w:evenHBand="0" w:firstRowFirstColumn="0" w:firstRowLastColumn="0" w:lastRowFirstColumn="0" w:lastRowLastColumn="0"/>
+            </w:pPr>
+            <w:r>
+              <w:t>Traçabilité des opérations</w:t>
+            </w:r>
+          </w:p>
+        </w:tc>
+        <w:tc>
+          <w:tcPr>
+            <w:tcW w:w="0" w:type="auto"/>
+            <w:hideMark/>
+          </w:tcPr>
+          <w:p>
+            <w:pPr>
+              <w:spacing w:line="276" w:lineRule="auto"/>
+              <w:cnfStyle w:val="000000000000" w:firstRow="0" w:lastRow="0" w:firstColumn="0" w:lastColumn="0" w:oddVBand="0" w:evenVBand="0" w:oddHBand="0" w:evenHBand="0" w:firstRowFirstColumn="0" w:firstRowLastColumn="0" w:lastRowFirstColumn="0" w:lastRowLastColumn="0"/>
+            </w:pPr>
+            <w:r>
+              <w:t>Historique des actions réalisées</w:t>
+            </w:r>
+          </w:p>
+        </w:tc>
+      </w:tr>
+      <w:tr>
+        <w:trPr>
+          <w:cnfStyle w:val="000000100000" w:firstRow="0" w:lastRow="0" w:firstColumn="0" w:lastColumn="0" w:oddVBand="0" w:evenVBand="0" w:oddHBand="1" w:evenHBand="0" w:firstRowFirstColumn="0" w:firstRowLastColumn="0" w:lastRowFirstColumn="0" w:lastRowLastColumn="0"/>
+          <w:trHeight w:val="290"/>
+        </w:trPr>
+        <w:tc>
+          <w:tcPr>
+            <w:cnfStyle w:val="001000000000" w:firstRow="0" w:lastRow="0" w:firstColumn="1" w:lastColumn="0" w:oddVBand="0" w:evenVBand="0" w:oddHBand="0" w:evenHBand="0" w:firstRowFirstColumn="0" w:firstRowLastColumn="0" w:lastRowFirstColumn="0" w:lastRowLastColumn="0"/>
+            <w:tcW w:w="0" w:type="auto"/>
+            <w:hideMark/>
+          </w:tcPr>
+          <w:p>
+            <w:pPr>
+              <w:spacing w:line="276" w:lineRule="auto"/>
+            </w:pPr>
+          </w:p>
+        </w:tc>
+        <w:tc>
+          <w:tcPr>
+            <w:tcW w:w="0" w:type="auto"/>
+            <w:hideMark/>
+          </w:tcPr>
+          <w:p>
+            <w:pPr>
+              <w:spacing w:line="276" w:lineRule="auto"/>
+              <w:cnfStyle w:val="000000100000" w:firstRow="0" w:lastRow="0" w:firstColumn="0" w:lastColumn="0" w:oddVBand="0" w:evenVBand="0" w:oddHBand="1" w:evenHBand="0" w:firstRowFirstColumn="0" w:firstRowLastColumn="0" w:lastRowFirstColumn="0" w:lastRowLastColumn="0"/>
+            </w:pPr>
+            <w:r>
+              <w:t>Cohérence des données</w:t>
+            </w:r>
+          </w:p>
+        </w:tc>
+        <w:tc>
+          <w:tcPr>
+            <w:tcW w:w="0" w:type="auto"/>
+            <w:hideMark/>
+          </w:tcPr>
+          <w:p>
+            <w:pPr>
+              <w:spacing w:line="276" w:lineRule="auto"/>
+              <w:cnfStyle w:val="000000100000" w:firstRow="0" w:lastRow="0" w:firstColumn="0" w:lastColumn="0" w:oddVBand="0" w:evenVBand="0" w:oddHBand="1" w:evenHBand="0" w:firstRowFirstColumn="0" w:firstRowLastColumn="0" w:lastRowFirstColumn="0" w:lastRowLastColumn="0"/>
+            </w:pPr>
+            <w:r>
+              <w:t>Intégrité des informations</w:t>
             </w:r>
           </w:p>
         </w:tc>
@@ -2300,142 +2503,47 @@
           <w:tcPr>
             <w:cnfStyle w:val="001000000000" w:firstRow="0" w:lastRow="0" w:firstColumn="1" w:lastColumn="0" w:oddVBand="0" w:evenVBand="0" w:oddHBand="0" w:evenHBand="0" w:firstRowFirstColumn="0" w:firstRowLastColumn="0" w:lastRowFirstColumn="0" w:lastRowLastColumn="0"/>
             <w:tcW w:w="0" w:type="auto"/>
-            <w:hideMark/>
-          </w:tcPr>
-          <w:p>
-            <w:pPr>
-              <w:spacing w:line="276" w:lineRule="auto"/>
-            </w:pPr>
-            <w:r>
-              <w:t>Ergonomie</w:t>
-            </w:r>
-          </w:p>
-        </w:tc>
-        <w:tc>
-          <w:tcPr>
-            <w:tcW w:w="0" w:type="auto"/>
-            <w:hideMark/>
-          </w:tcPr>
-          <w:p>
-            <w:pPr>
-              <w:spacing w:line="276" w:lineRule="auto"/>
+          </w:tcPr>
+          <w:p>
+            <w:pPr>
+              <w:rPr>
+                <w:b w:val="0"/>
+                <w:bCs w:val="0"/>
+              </w:rPr>
+            </w:pPr>
+            <w:r>
+              <w:t xml:space="preserve">Responsabilité </w:t>
+            </w:r>
+          </w:p>
+          <w:p>
+            <w:r>
+              <w:t>environnementale</w:t>
+            </w:r>
+          </w:p>
+        </w:tc>
+        <w:tc>
+          <w:tcPr>
+            <w:tcW w:w="0" w:type="auto"/>
+          </w:tcPr>
+          <w:p>
+            <w:pPr>
               <w:cnfStyle w:val="000000000000" w:firstRow="0" w:lastRow="0" w:firstColumn="0" w:lastColumn="0" w:oddVBand="0" w:evenVBand="0" w:oddHBand="0" w:evenHBand="0" w:firstRowFirstColumn="0" w:firstRowLastColumn="0" w:lastRowFirstColumn="0" w:lastRowLastColumn="0"/>
             </w:pPr>
             <w:r>
-              <w:t>Interface simple et accessible</w:t>
-            </w:r>
-          </w:p>
-        </w:tc>
-        <w:tc>
-          <w:tcPr>
-            <w:tcW w:w="0" w:type="auto"/>
-            <w:hideMark/>
-          </w:tcPr>
-          <w:p>
-            <w:pPr>
-              <w:spacing w:line="276" w:lineRule="auto"/>
+              <w:t>Mise en place de principes d’éco-conception</w:t>
+            </w:r>
+          </w:p>
+        </w:tc>
+        <w:tc>
+          <w:tcPr>
+            <w:tcW w:w="0" w:type="auto"/>
+          </w:tcPr>
+          <w:p>
+            <w:pPr>
               <w:cnfStyle w:val="000000000000" w:firstRow="0" w:lastRow="0" w:firstColumn="0" w:lastColumn="0" w:oddVBand="0" w:evenVBand="0" w:oddHBand="0" w:evenHBand="0" w:firstRowFirstColumn="0" w:firstRowLastColumn="0" w:lastRowFirstColumn="0" w:lastRowLastColumn="0"/>
             </w:pPr>
             <w:r>
-              <w:t>Facilité d'utilisation pour tous</w:t>
-            </w:r>
-          </w:p>
-        </w:tc>
-      </w:tr>
-      <w:tr>
-        <w:trPr>
-          <w:cnfStyle w:val="000000100000" w:firstRow="0" w:lastRow="0" w:firstColumn="0" w:lastColumn="0" w:oddVBand="0" w:evenVBand="0" w:oddHBand="1" w:evenHBand="0" w:firstRowFirstColumn="0" w:firstRowLastColumn="0" w:lastRowFirstColumn="0" w:lastRowLastColumn="0"/>
-          <w:trHeight w:val="282"/>
-        </w:trPr>
-        <w:tc>
-          <w:tcPr>
-            <w:cnfStyle w:val="001000000000" w:firstRow="0" w:lastRow="0" w:firstColumn="1" w:lastColumn="0" w:oddVBand="0" w:evenVBand="0" w:oddHBand="0" w:evenHBand="0" w:firstRowFirstColumn="0" w:firstRowLastColumn="0" w:lastRowFirstColumn="0" w:lastRowLastColumn="0"/>
-            <w:tcW w:w="0" w:type="auto"/>
-            <w:hideMark/>
-          </w:tcPr>
-          <w:p>
-            <w:pPr>
-              <w:spacing w:line="276" w:lineRule="auto"/>
-            </w:pPr>
-            <w:r>
-              <w:t>Fiabilité</w:t>
-            </w:r>
-          </w:p>
-        </w:tc>
-        <w:tc>
-          <w:tcPr>
-            <w:tcW w:w="0" w:type="auto"/>
-            <w:hideMark/>
-          </w:tcPr>
-          <w:p>
-            <w:pPr>
-              <w:spacing w:line="276" w:lineRule="auto"/>
-              <w:cnfStyle w:val="000000100000" w:firstRow="0" w:lastRow="0" w:firstColumn="0" w:lastColumn="0" w:oddVBand="0" w:evenVBand="0" w:oddHBand="1" w:evenHBand="0" w:firstRowFirstColumn="0" w:firstRowLastColumn="0" w:lastRowFirstColumn="0" w:lastRowLastColumn="0"/>
-            </w:pPr>
-            <w:r>
-              <w:t>Traçabilité des opérations</w:t>
-            </w:r>
-          </w:p>
-        </w:tc>
-        <w:tc>
-          <w:tcPr>
-            <w:tcW w:w="0" w:type="auto"/>
-            <w:hideMark/>
-          </w:tcPr>
-          <w:p>
-            <w:pPr>
-              <w:spacing w:line="276" w:lineRule="auto"/>
-              <w:cnfStyle w:val="000000100000" w:firstRow="0" w:lastRow="0" w:firstColumn="0" w:lastColumn="0" w:oddVBand="0" w:evenVBand="0" w:oddHBand="1" w:evenHBand="0" w:firstRowFirstColumn="0" w:firstRowLastColumn="0" w:lastRowFirstColumn="0" w:lastRowLastColumn="0"/>
-            </w:pPr>
-            <w:r>
-              <w:t>Historique des actions réalisées</w:t>
-            </w:r>
-          </w:p>
-        </w:tc>
-      </w:tr>
-      <w:tr>
-        <w:trPr>
-          <w:trHeight w:val="290"/>
-        </w:trPr>
-        <w:tc>
-          <w:tcPr>
-            <w:cnfStyle w:val="001000000000" w:firstRow="0" w:lastRow="0" w:firstColumn="1" w:lastColumn="0" w:oddVBand="0" w:evenVBand="0" w:oddHBand="0" w:evenHBand="0" w:firstRowFirstColumn="0" w:firstRowLastColumn="0" w:lastRowFirstColumn="0" w:lastRowLastColumn="0"/>
-            <w:tcW w:w="0" w:type="auto"/>
-            <w:hideMark/>
-          </w:tcPr>
-          <w:p>
-            <w:pPr>
-              <w:spacing w:line="276" w:lineRule="auto"/>
-            </w:pPr>
-          </w:p>
-        </w:tc>
-        <w:tc>
-          <w:tcPr>
-            <w:tcW w:w="0" w:type="auto"/>
-            <w:hideMark/>
-          </w:tcPr>
-          <w:p>
-            <w:pPr>
-              <w:spacing w:line="276" w:lineRule="auto"/>
-              <w:cnfStyle w:val="000000000000" w:firstRow="0" w:lastRow="0" w:firstColumn="0" w:lastColumn="0" w:oddVBand="0" w:evenVBand="0" w:oddHBand="0" w:evenHBand="0" w:firstRowFirstColumn="0" w:firstRowLastColumn="0" w:lastRowFirstColumn="0" w:lastRowLastColumn="0"/>
-            </w:pPr>
-            <w:r>
-              <w:t>Cohérence des données</w:t>
-            </w:r>
-          </w:p>
-        </w:tc>
-        <w:tc>
-          <w:tcPr>
-            <w:tcW w:w="0" w:type="auto"/>
-            <w:hideMark/>
-          </w:tcPr>
-          <w:p>
-            <w:pPr>
-              <w:spacing w:line="276" w:lineRule="auto"/>
-              <w:cnfStyle w:val="000000000000" w:firstRow="0" w:lastRow="0" w:firstColumn="0" w:lastColumn="0" w:oddVBand="0" w:evenVBand="0" w:oddHBand="0" w:evenHBand="0" w:firstRowFirstColumn="0" w:firstRowLastColumn="0" w:lastRowFirstColumn="0" w:lastRowLastColumn="0"/>
-            </w:pPr>
-            <w:r>
-              <w:t>Intégrité des informations</w:t>
+              <w:t>Optimisations techniques pour limiter l’impact énergétique de l’application</w:t>
             </w:r>
           </w:p>
         </w:tc>
@@ -6696,26 +6804,6 @@
 </file>
 
 <file path=customXml/item1.xml><?xml version="1.0" encoding="utf-8"?>
-<p:properties xmlns:p="http://schemas.microsoft.com/office/2006/metadata/properties" xmlns:xsi="http://www.w3.org/2001/XMLSchema-instance" xmlns:pc="http://schemas.microsoft.com/office/infopath/2007/PartnerControls">
-  <documentManagement>
-    <TaxCatchAll xmlns="ce821054-8c93-4705-bae7-0fe9e54d362a" xsi:nil="true"/>
-    <lcf76f155ced4ddcb4097134ff3c332f xmlns="af5cda8a-63f3-4b50-8d81-baad6d0264b2">
-      <Terms xmlns="http://schemas.microsoft.com/office/infopath/2007/PartnerControls"/>
-    </lcf76f155ced4ddcb4097134ff3c332f>
-  </documentManagement>
-</p:properties>
-</file>
-
-<file path=customXml/item2.xml><?xml version="1.0" encoding="utf-8"?>
-<?mso-contentType ?>
-<FormTemplates xmlns="http://schemas.microsoft.com/sharepoint/v3/contenttype/forms">
-  <Display>DocumentLibraryForm</Display>
-  <Edit>DocumentLibraryForm</Edit>
-  <New>DocumentLibraryForm</New>
-</FormTemplates>
-</file>
-
-<file path=customXml/item3.xml><?xml version="1.0" encoding="utf-8"?>
 <ct:contentTypeSchema xmlns:ct="http://schemas.microsoft.com/office/2006/metadata/contentType" xmlns:ma="http://schemas.microsoft.com/office/2006/metadata/properties/metaAttributes" ct:_="" ma:_="" ma:contentTypeName="Document" ma:contentTypeID="0x010100DBBC4F2AA7CF6B44B361094226374374" ma:contentTypeVersion="11" ma:contentTypeDescription="Create a new document." ma:contentTypeScope="" ma:versionID="36beb9c595414d7bdee66b55113aade5">
   <xsd:schema xmlns:xsd="http://www.w3.org/2001/XMLSchema" xmlns:xs="http://www.w3.org/2001/XMLSchema" xmlns:p="http://schemas.microsoft.com/office/2006/metadata/properties" xmlns:ns2="af5cda8a-63f3-4b50-8d81-baad6d0264b2" xmlns:ns3="ce821054-8c93-4705-bae7-0fe9e54d362a" targetNamespace="http://schemas.microsoft.com/office/2006/metadata/properties" ma:root="true" ma:fieldsID="71e6572361651cea5c7c70757a9d12d6" ns2:_="" ns3:_="">
     <xsd:import namespace="af5cda8a-63f3-4b50-8d81-baad6d0264b2"/>
@@ -6910,26 +6998,27 @@
 </ct:contentTypeSchema>
 </file>
 
-<file path=customXml/itemProps1.xml><?xml version="1.0" encoding="utf-8"?>
-<ds:datastoreItem xmlns:ds="http://schemas.openxmlformats.org/officeDocument/2006/customXml" ds:itemID="{DBC76E31-5229-4379-876A-258E8836B89C}">
-  <ds:schemaRefs>
-    <ds:schemaRef ds:uri="http://schemas.microsoft.com/office/2006/metadata/properties"/>
-    <ds:schemaRef ds:uri="http://schemas.microsoft.com/office/infopath/2007/PartnerControls"/>
-    <ds:schemaRef ds:uri="ce821054-8c93-4705-bae7-0fe9e54d362a"/>
-    <ds:schemaRef ds:uri="af5cda8a-63f3-4b50-8d81-baad6d0264b2"/>
-  </ds:schemaRefs>
-</ds:datastoreItem>
+<file path=customXml/item2.xml><?xml version="1.0" encoding="utf-8"?>
+<?mso-contentType ?>
+<FormTemplates xmlns="http://schemas.microsoft.com/sharepoint/v3/contenttype/forms">
+  <Display>DocumentLibraryForm</Display>
+  <Edit>DocumentLibraryForm</Edit>
+  <New>DocumentLibraryForm</New>
+</FormTemplates>
 </file>
 
-<file path=customXml/itemProps2.xml><?xml version="1.0" encoding="utf-8"?>
-<ds:datastoreItem xmlns:ds="http://schemas.openxmlformats.org/officeDocument/2006/customXml" ds:itemID="{819B0383-12D6-44A8-BAAF-0D592D5A467D}">
-  <ds:schemaRefs>
-    <ds:schemaRef ds:uri="http://schemas.microsoft.com/sharepoint/v3/contenttype/forms"/>
-  </ds:schemaRefs>
-</ds:datastoreItem>
+<file path=customXml/item3.xml><?xml version="1.0" encoding="utf-8"?>
+<p:properties xmlns:p="http://schemas.microsoft.com/office/2006/metadata/properties" xmlns:xsi="http://www.w3.org/2001/XMLSchema-instance" xmlns:pc="http://schemas.microsoft.com/office/infopath/2007/PartnerControls">
+  <documentManagement>
+    <TaxCatchAll xmlns="ce821054-8c93-4705-bae7-0fe9e54d362a" xsi:nil="true"/>
+    <lcf76f155ced4ddcb4097134ff3c332f xmlns="af5cda8a-63f3-4b50-8d81-baad6d0264b2">
+      <Terms xmlns="http://schemas.microsoft.com/office/infopath/2007/PartnerControls"/>
+    </lcf76f155ced4ddcb4097134ff3c332f>
+  </documentManagement>
+</p:properties>
 </file>
 
-<file path=customXml/itemProps3.xml><?xml version="1.0" encoding="utf-8"?>
+<file path=customXml/itemProps1.xml><?xml version="1.0" encoding="utf-8"?>
 <ds:datastoreItem xmlns:ds="http://schemas.openxmlformats.org/officeDocument/2006/customXml" ds:itemID="{C3BD5574-F90E-4CDB-962D-E3AED9437A5C}">
   <ds:schemaRefs>
     <ds:schemaRef ds:uri="http://schemas.microsoft.com/office/2006/metadata/contentType"/>
@@ -6946,4 +7035,23 @@
     <ds:schemaRef ds:uri="http://schemas.microsoft.com/internal/obd"/>
   </ds:schemaRefs>
 </ds:datastoreItem>
+</file>
+
+<file path=customXml/itemProps2.xml><?xml version="1.0" encoding="utf-8"?>
+<ds:datastoreItem xmlns:ds="http://schemas.openxmlformats.org/officeDocument/2006/customXml" ds:itemID="{819B0383-12D6-44A8-BAAF-0D592D5A467D}">
+  <ds:schemaRefs>
+    <ds:schemaRef ds:uri="http://schemas.microsoft.com/sharepoint/v3/contenttype/forms"/>
+  </ds:schemaRefs>
+</ds:datastoreItem>
+</file>
+
+<file path=customXml/itemProps3.xml><?xml version="1.0" encoding="utf-8"?>
+<ds:datastoreItem xmlns:ds="http://schemas.openxmlformats.org/officeDocument/2006/customXml" ds:itemID="{DBC76E31-5229-4379-876A-258E8836B89C}">
+  <ds:schemaRefs>
+    <ds:schemaRef ds:uri="http://schemas.microsoft.com/office/2006/metadata/properties"/>
+    <ds:schemaRef ds:uri="http://schemas.microsoft.com/office/infopath/2007/PartnerControls"/>
+    <ds:schemaRef ds:uri="ce821054-8c93-4705-bae7-0fe9e54d362a"/>
+    <ds:schemaRef ds:uri="af5cda8a-63f3-4b50-8d81-baad6d0264b2"/>
+  </ds:schemaRefs>
+</ds:datastoreItem>
 </file>
</xml_diff>